<commit_message>
formateo rz social en campos de firma.
</commit_message>
<xml_diff>
--- a/formatos/formatos_cesiones_mx/cesion_fisica_a_moral_mx.docx
+++ b/formatos/formatos_cesiones_mx/cesion_fisica_a_moral_mx.docx
@@ -2087,42 +2087,55 @@
               <w:jc w:val="center"/>
               <w:rPr>
                 <w:rFonts w:ascii="Garamond" w:eastAsia="Garamond" w:hAnsi="Garamond" w:cs="Garamond"/>
+                <w:bCs/>
                 <w:sz w:val="20"/>
                 <w:szCs w:val="20"/>
                 <w:highlight w:val="yellow"/>
               </w:rPr>
             </w:pPr>
+            <w:proofErr w:type="gramStart"/>
             <w:r>
               <w:rPr>
                 <w:rFonts w:ascii="Garamond" w:eastAsia="Garamond" w:hAnsi="Garamond" w:cs="Garamond"/>
-                <w:b/>
-                <w:sz w:val="21"/>
-                <w:szCs w:val="21"/>
+                <w:bCs/>
+                <w:sz w:val="20"/>
+                <w:szCs w:val="20"/>
                 <w:highlight w:val="yellow"/>
               </w:rPr>
-              <w:t xml:space="preserve">{{ </w:t>
+              <w:t>{{ RS</w:t>
             </w:r>
-            <w:proofErr w:type="spellStart"/>
+            <w:proofErr w:type="gramEnd"/>
             <w:r>
               <w:rPr>
                 <w:rFonts w:ascii="Garamond" w:eastAsia="Garamond" w:hAnsi="Garamond" w:cs="Garamond"/>
-                <w:b/>
-                <w:sz w:val="21"/>
-                <w:szCs w:val="21"/>
+                <w:bCs/>
+                <w:sz w:val="20"/>
+                <w:szCs w:val="20"/>
                 <w:highlight w:val="yellow"/>
               </w:rPr>
-              <w:t>RS_CESIONARIO|upper</w:t>
+              <w:t>_CESIONARIO_</w:t>
             </w:r>
-            <w:proofErr w:type="spellEnd"/>
+            <w:proofErr w:type="gramStart"/>
             <w:r>
               <w:rPr>
                 <w:rFonts w:ascii="Garamond" w:eastAsia="Garamond" w:hAnsi="Garamond" w:cs="Garamond"/>
-                <w:b/>
-                <w:sz w:val="21"/>
-                <w:szCs w:val="21"/>
+                <w:bCs/>
+                <w:sz w:val="20"/>
+                <w:szCs w:val="20"/>
                 <w:highlight w:val="yellow"/>
               </w:rPr>
-              <w:t xml:space="preserve"> }}</w:t>
+              <w:t>FIRMA }</w:t>
+            </w:r>
+            <w:proofErr w:type="gramEnd"/>
+            <w:r>
+              <w:rPr>
+                <w:rFonts w:ascii="Garamond" w:eastAsia="Garamond" w:hAnsi="Garamond" w:cs="Garamond"/>
+                <w:bCs/>
+                <w:sz w:val="20"/>
+                <w:szCs w:val="20"/>
+                <w:highlight w:val="yellow"/>
+              </w:rPr>
+              <w:t>}</w:t>
             </w:r>
           </w:p>
           <w:p>
@@ -2137,6 +2150,7 @@
               <w:jc w:val="center"/>
               <w:rPr>
                 <w:rFonts w:ascii="Garamond" w:eastAsia="Garamond" w:hAnsi="Garamond" w:cs="Garamond"/>
+                <w:bCs/>
                 <w:sz w:val="20"/>
                 <w:szCs w:val="20"/>
                 <w:highlight w:val="yellow"/>
@@ -3127,7 +3141,6 @@
   <w:style w:type="character" w:default="1" w:styleId="Fuentedeprrafopredeter">
     <w:name w:val="Default Paragraph Font"/>
     <w:uiPriority w:val="1"/>
-    <w:semiHidden/>
     <w:unhideWhenUsed/>
   </w:style>
   <w:style w:type="table" w:default="1" w:styleId="Tablanormal">

</xml_diff>